<commit_message>
fix(slides): remove the Practice Exam slide — no practice exam exists for this course
The exams.tertiaryinfotech.com portal carries vendor certification exams only
(AWS, Microsoft, Cisco, Anthropic); a search for n8n returns 404. The slide
pointed learners at a portal with nothing for this course, so it is removed
rather than left as a dead end.

- Deck back to 268 slides / 268 PDF pages; footers renumbered after the deletion
- All 268 slides retain their fade transition
- Deleted the now-unused practice-exams-portal.png screenshot
- LP: Topic 8 slide ranges corrected 260–268 -> 260–267 so the lesson plan stays
  in sync with the deck

Note: this leaves QA checklist item A4 (Practice Exam slide) unmet by design —
the artifact it asks for does not exist for TGS-2026062147.

Co-Authored-By: Claude Opus 4.8 (1M context) <noreply@anthropic.com>
</commit_message>
<xml_diff>
--- a/courseware/LP-No Code and Low Code Agentic AI Applications.docx
+++ b/courseware/LP-No Code and Low Code Agentic AI Applications.docx
@@ -6946,10 +6946,9 @@
             <w:r>
               <w:rPr>
                 <w:rFonts w:ascii="Arial" w:hAnsi="Arial"/>
-                <w:b w:val="0"/>
                 <w:sz w:val="19"/>
               </w:rPr>
-              <w:t>260–268</w:t>
+              <w:t>260–267</w:t>
             </w:r>
           </w:p>
         </w:tc>
@@ -7018,10 +7017,9 @@
             <w:r>
               <w:rPr>
                 <w:rFonts w:ascii="Arial" w:hAnsi="Arial"/>
-                <w:b w:val="0"/>
                 <w:sz w:val="19"/>
               </w:rPr>
-              <w:t>263–268</w:t>
+              <w:t>263–267</w:t>
             </w:r>
           </w:p>
         </w:tc>
@@ -7090,10 +7088,9 @@
             <w:r>
               <w:rPr>
                 <w:rFonts w:ascii="Arial" w:hAnsi="Arial"/>
-                <w:b w:val="0"/>
                 <w:sz w:val="19"/>
               </w:rPr>
-              <w:t>260–268</w:t>
+              <w:t>260–267</w:t>
             </w:r>
           </w:p>
         </w:tc>
@@ -7239,10 +7236,9 @@
             <w:r>
               <w:rPr>
                 <w:rFonts w:ascii="Arial" w:hAnsi="Arial"/>
-                <w:b w:val="0"/>
                 <w:sz w:val="19"/>
               </w:rPr>
-              <w:t>260–268</w:t>
+              <w:t>260–267</w:t>
             </w:r>
           </w:p>
         </w:tc>
@@ -7311,10 +7307,9 @@
             <w:r>
               <w:rPr>
                 <w:rFonts w:ascii="Arial" w:hAnsi="Arial"/>
-                <w:b w:val="0"/>
                 <w:sz w:val="19"/>
               </w:rPr>
-              <w:t>263–268</w:t>
+              <w:t>263–267</w:t>
             </w:r>
           </w:p>
         </w:tc>

</xml_diff>